<commit_message>
Publish v0.1.1 manuscript record
</commit_message>
<xml_diff>
--- a/paper/manuscript_ko.docx
+++ b/paper/manuscript_ko.docx
@@ -6098,12 +6098,38 @@
         <w:pStyle w:val="Heading1"/>
       </w:pPr>
       <w:r>
+        <w:t>코드 및 데이터 이용 가능성</w:t>
+      </w:r>
+    </w:p>
+    <w:p>
+      <w:r>
+        <w:t>본 연구의 계산 결과, 그림 생성 코드와 후처리 패키지는 GitHub(https://github.com/lyullee/lh2-psv-tno-risk)에 공개하였다. 공개 릴리스의 장기 보존본은 Zenodo DOI(https://doi.org/10.5281/zenodo.23105208)에서 확인할 수 있다. Python 후처리 패키지는 PyPI(https://pypi.org/project/lh2-psv-tno-risk/)에 `lh2-psv-tno-risk` 버전 0.1.1로 배포하였다.</w:t>
+      </w:r>
+    </w:p>
+    <w:p>
+      <w:pPr>
+        <w:pStyle w:val="Heading1"/>
+      </w:pPr>
+      <w:r>
+        <w:t>감사의 글</w:t>
+      </w:r>
+    </w:p>
+    <w:p>
+      <w:r>
+        <w:t>본 연구는 기후에너지환경부(MCEE)와 한국에너지기술평가원(KETEP)의 지원을 받아 수행한 연구과제입니다(No. RS-2025-02311196).</w:t>
+      </w:r>
+    </w:p>
+    <w:p>
+      <w:pPr>
+        <w:pStyle w:val="Heading1"/>
+      </w:pPr>
+      <w:r>
         <w:t>재현 자료</w:t>
       </w:r>
     </w:p>
     <w:p>
       <w:r>
-        <w:t>탱크와 PSV 민감도 계산에는 calculate_center_lh2_sweep.py와 calculate_center_secondary_sweep.py를 사용하였다. 액화수소 제어체적의 온도, 질량, 평형 증기품질은 calculate_lh2_phase_dynamics.py로 계산하였다. 위험도와 벤트 출구상태는 calculate_vent_fire_risk_sensitivity.py, calculate_risk_model_matrix.py, calculate_vent_route_curves.py로 계산하였다. Figure 1, 2, 4, 5는 plot_parameter_comparisons.py로, Figure 3은 summarize_lh2_phase_dynamics.py로 다시 만들 수 있다. 입력값, 시간 이력, 요약 결과는 Center_LH2_Risk_Sweep_20260929와 LH2_Phase_Dynamics_20261002 폴더에 저장하였다.</w:t>
+        <w:t>탱크와 PSV 민감도 계산에는 calculate_center_lh2_sweep.py와 calculate_center_secondary_sweep.py를 사용하였다. 액화수소 제어체적의 온도, 질량, 평형 증기품질은 calculate_lh2_phase_dynamics.py로 계산하였다. 위험도와 벤트 출구상태는 calculate_vent_fire_risk_sensitivity.py, calculate_risk_model_matrix.py, calculate_vent_route_curves.py로 계산하였다. Figure 1, 2, 4, 5는 plot_parameter_comparisons.py로, Figure 3은 summarize_lh2_phase_dynamics.py로 다시 만들 수 있다. 공개 저장소에는 본문에 사용한 입력값, 시간 이력, 요약 결과와 그림 생성 코드를 함께 수록하였다.</w:t>
       </w:r>
     </w:p>
     <w:p>

</xml_diff>